<commit_message>
feat: operating conditions panel — UI, storage, Word export
- OperatingConditions model (Application/Models)
- IOperatingConditionsService + implementation (load/save JSON)
- ProjectStore: add Conditions, ConditionsFilePath
- OperatingConditionsViewModel: fields, Save/Load commands, IsSaved with auto-reset
- ConditionRow UserControl for reusable label+input rows
- Form4View: slide-in/out panel with animation, save checkmark, mouse-leave auto-close
- Form4ViewModel: inject IOperatingConditionsService, expose Conditions VM
- WordFormData: add OperatingConditions field
- WordFormMap: add OperatingConditionCells dictionary
- WordFormMapLoader: parse operatingConditionCells from map.json
- WordService: fill conditions into original table before cloning
- DependencyInjection: register IOperatingConditionsService
</commit_message>
<xml_diff>
--- a/tests/OperationMaps.Tests/TestData/Forms/Form4.docx
+++ b/tests/OperationMaps.Tests/TestData/Forms/Form4.docx
@@ -869,15 +869,13 @@
                 <w:szCs w:val="24"/>
               </w:rPr>
             </w:pPr>
-            <w:proofErr w:type="gramStart"/>
-            <w:r>
-              <w:rPr>
-                <w:sz w:val="24"/>
-                <w:szCs w:val="24"/>
-              </w:rPr>
-              <w:t xml:space="preserve">Условия  эксплуатации  в  аппаратуре</w:t>
-            </w:r>
-            <w:proofErr w:type="gramEnd"/>
+            <w:r>
+              <w:rPr>
+                <w:sz w:val="24"/>
+                <w:szCs w:val="24"/>
+              </w:rPr>
+              <w:t>Условия эксплуатации в аппаратуре</w:t>
+            </w:r>
           </w:p>
         </w:tc>
         <w:tc>
@@ -901,6 +899,9 @@
                 <w:highlight w:val="magenta"/>
               </w:rPr>
             </w:pPr>
+            <w:r>
+              <w:t xml:space="preserve">1</w:t>
+            </w:r>
           </w:p>
         </w:tc>
         <w:tc>
@@ -1182,6 +1183,9 @@
                 <w:lang w:val="en-US"/>
               </w:rPr>
             </w:pPr>
+            <w:r>
+              <w:t xml:space="preserve">2</w:t>
+            </w:r>
           </w:p>
         </w:tc>
         <w:tc>
@@ -1441,6 +1445,9 @@
                 <w:highlight w:val="magenta"/>
               </w:rPr>
             </w:pPr>
+            <w:r>
+              <w:t xml:space="preserve">3</w:t>
+            </w:r>
           </w:p>
         </w:tc>
         <w:tc>
@@ -1490,10 +1497,8 @@
                 <w:sz w:val="24"/>
                 <w:szCs w:val="24"/>
               </w:rPr>
-              <w:t xml:space="preserve">показатель сохраняемости,  лет</w:t>
-            </w:r>
-            <w:proofErr w:type="gramStart"/>
-            <w:proofErr w:type="gramEnd"/>
+              <w:t>показатель сохраняемости, лет</w:t>
+            </w:r>
           </w:p>
         </w:tc>
         <w:tc>
@@ -1712,6 +1717,9 @@
                 <w:lang w:val="en-US"/>
               </w:rPr>
             </w:pPr>
+            <w:r>
+              <w:t xml:space="preserve">4</w:t>
+            </w:r>
           </w:p>
         </w:tc>
         <w:tc>
@@ -1999,6 +2007,9 @@
                 <w:highlight w:val="magenta"/>
               </w:rPr>
             </w:pPr>
+            <w:r>
+              <w:t xml:space="preserve">5</w:t>
+            </w:r>
           </w:p>
         </w:tc>
         <w:tc>
@@ -2264,6 +2275,9 @@
                 <w:highlight w:val="magenta"/>
               </w:rPr>
             </w:pPr>
+            <w:r>
+              <w:t xml:space="preserve">6</w:t>
+            </w:r>
           </w:p>
         </w:tc>
         <w:tc>
@@ -2530,6 +2544,9 @@
                 <w:highlight w:val="magenta"/>
               </w:rPr>
             </w:pPr>
+            <w:r>
+              <w:t xml:space="preserve">7</w:t>
+            </w:r>
           </w:p>
         </w:tc>
         <w:tc>
@@ -2579,10 +2596,8 @@
                 <w:sz w:val="24"/>
                 <w:szCs w:val="24"/>
               </w:rPr>
-              <w:t xml:space="preserve">давление окр. среды</w:t>
-            </w:r>
-            <w:proofErr w:type="spellStart"/>
-            <w:proofErr w:type="spellEnd"/>
+              <w:t>давление окр. среды</w:t>
+            </w:r>
           </w:p>
         </w:tc>
         <w:tc>
@@ -2796,6 +2811,9 @@
                 <w:highlight w:val="magenta"/>
               </w:rPr>
             </w:pPr>
+            <w:r>
+              <w:t xml:space="preserve">8</w:t>
+            </w:r>
           </w:p>
         </w:tc>
         <w:tc>
@@ -3057,6 +3075,9 @@
                 <w:highlight w:val="magenta"/>
               </w:rPr>
             </w:pPr>
+            <w:r>
+              <w:t xml:space="preserve">9</w:t>
+            </w:r>
           </w:p>
         </w:tc>
         <w:tc>
@@ -3330,6 +3351,9 @@
                 <w:highlight w:val="magenta"/>
               </w:rPr>
             </w:pPr>
+            <w:r>
+              <w:t xml:space="preserve">10</w:t>
+            </w:r>
           </w:p>
         </w:tc>
         <w:tc>
@@ -3590,6 +3614,9 @@
                 <w:highlight w:val="magenta"/>
               </w:rPr>
             </w:pPr>
+            <w:r>
+              <w:t xml:space="preserve">11</w:t>
+            </w:r>
           </w:p>
         </w:tc>
         <w:tc>
@@ -3859,6 +3886,9 @@
                 <w:lang w:val="en-US"/>
               </w:rPr>
             </w:pPr>
+            <w:r>
+              <w:t xml:space="preserve">12</w:t>
+            </w:r>
           </w:p>
         </w:tc>
         <w:tc>
@@ -5432,15 +5462,13 @@
                 <w:szCs w:val="24"/>
               </w:rPr>
             </w:pPr>
-            <w:proofErr w:type="gramStart"/>
-            <w:r>
-              <w:rPr>
-                <w:sz w:val="24"/>
-                <w:szCs w:val="24"/>
-              </w:rPr>
-              <w:t xml:space="preserve">Условия  эксплуатации  в  аппаратуре</w:t>
-            </w:r>
-            <w:proofErr w:type="gramEnd"/>
+            <w:r>
+              <w:rPr>
+                <w:sz w:val="24"/>
+                <w:szCs w:val="24"/>
+              </w:rPr>
+              <w:t>Условия эксплуатации в аппаратуре</w:t>
+            </w:r>
           </w:p>
         </w:tc>
         <w:tc>
@@ -5464,6 +5492,9 @@
                 <w:highlight w:val="magenta"/>
               </w:rPr>
             </w:pPr>
+            <w:r>
+              <w:t xml:space="preserve">1</w:t>
+            </w:r>
           </w:p>
         </w:tc>
         <w:tc>
@@ -5745,6 +5776,9 @@
                 <w:lang w:val="en-US"/>
               </w:rPr>
             </w:pPr>
+            <w:r>
+              <w:t xml:space="preserve">2</w:t>
+            </w:r>
           </w:p>
         </w:tc>
         <w:tc>
@@ -6004,6 +6038,9 @@
                 <w:highlight w:val="magenta"/>
               </w:rPr>
             </w:pPr>
+            <w:r>
+              <w:t xml:space="preserve">3</w:t>
+            </w:r>
           </w:p>
         </w:tc>
         <w:tc>
@@ -6053,10 +6090,8 @@
                 <w:sz w:val="24"/>
                 <w:szCs w:val="24"/>
               </w:rPr>
-              <w:t xml:space="preserve">показатель сохраняемости,  лет</w:t>
-            </w:r>
-            <w:proofErr w:type="gramStart"/>
-            <w:proofErr w:type="gramEnd"/>
+              <w:t>показатель сохраняемости, лет</w:t>
+            </w:r>
           </w:p>
         </w:tc>
         <w:tc>
@@ -6275,6 +6310,9 @@
                 <w:lang w:val="en-US"/>
               </w:rPr>
             </w:pPr>
+            <w:r>
+              <w:t xml:space="preserve">4</w:t>
+            </w:r>
           </w:p>
         </w:tc>
         <w:tc>
@@ -6562,6 +6600,9 @@
                 <w:highlight w:val="magenta"/>
               </w:rPr>
             </w:pPr>
+            <w:r>
+              <w:t xml:space="preserve">5</w:t>
+            </w:r>
           </w:p>
         </w:tc>
         <w:tc>
@@ -6827,6 +6868,9 @@
                 <w:highlight w:val="magenta"/>
               </w:rPr>
             </w:pPr>
+            <w:r>
+              <w:t xml:space="preserve">6</w:t>
+            </w:r>
           </w:p>
         </w:tc>
         <w:tc>
@@ -7093,6 +7137,9 @@
                 <w:highlight w:val="magenta"/>
               </w:rPr>
             </w:pPr>
+            <w:r>
+              <w:t xml:space="preserve">7</w:t>
+            </w:r>
           </w:p>
         </w:tc>
         <w:tc>
@@ -7142,10 +7189,8 @@
                 <w:sz w:val="24"/>
                 <w:szCs w:val="24"/>
               </w:rPr>
-              <w:t xml:space="preserve">давление окр. среды</w:t>
-            </w:r>
-            <w:proofErr w:type="spellStart"/>
-            <w:proofErr w:type="spellEnd"/>
+              <w:t>давление окр. среды</w:t>
+            </w:r>
           </w:p>
         </w:tc>
         <w:tc>
@@ -7359,6 +7404,9 @@
                 <w:highlight w:val="magenta"/>
               </w:rPr>
             </w:pPr>
+            <w:r>
+              <w:t xml:space="preserve">8</w:t>
+            </w:r>
           </w:p>
         </w:tc>
         <w:tc>
@@ -7620,6 +7668,9 @@
                 <w:highlight w:val="magenta"/>
               </w:rPr>
             </w:pPr>
+            <w:r>
+              <w:t xml:space="preserve">9</w:t>
+            </w:r>
           </w:p>
         </w:tc>
         <w:tc>
@@ -7893,6 +7944,9 @@
                 <w:highlight w:val="magenta"/>
               </w:rPr>
             </w:pPr>
+            <w:r>
+              <w:t xml:space="preserve">10</w:t>
+            </w:r>
           </w:p>
         </w:tc>
         <w:tc>
@@ -8153,6 +8207,9 @@
                 <w:highlight w:val="magenta"/>
               </w:rPr>
             </w:pPr>
+            <w:r>
+              <w:t xml:space="preserve">11</w:t>
+            </w:r>
           </w:p>
         </w:tc>
         <w:tc>
@@ -8422,6 +8479,9 @@
                 <w:lang w:val="en-US"/>
               </w:rPr>
             </w:pPr>
+            <w:r>
+              <w:t xml:space="preserve">12</w:t>
+            </w:r>
           </w:p>
         </w:tc>
         <w:tc>
@@ -9995,15 +10055,13 @@
                 <w:szCs w:val="24"/>
               </w:rPr>
             </w:pPr>
-            <w:proofErr w:type="gramStart"/>
-            <w:r>
-              <w:rPr>
-                <w:sz w:val="24"/>
-                <w:szCs w:val="24"/>
-              </w:rPr>
-              <w:t xml:space="preserve">Условия  эксплуатации  в  аппаратуре</w:t>
-            </w:r>
-            <w:proofErr w:type="gramEnd"/>
+            <w:r>
+              <w:rPr>
+                <w:sz w:val="24"/>
+                <w:szCs w:val="24"/>
+              </w:rPr>
+              <w:t>Условия эксплуатации в аппаратуре</w:t>
+            </w:r>
           </w:p>
         </w:tc>
         <w:tc>
@@ -10027,6 +10085,9 @@
                 <w:highlight w:val="magenta"/>
               </w:rPr>
             </w:pPr>
+            <w:r>
+              <w:t xml:space="preserve">1</w:t>
+            </w:r>
           </w:p>
         </w:tc>
         <w:tc>
@@ -10308,6 +10369,9 @@
                 <w:lang w:val="en-US"/>
               </w:rPr>
             </w:pPr>
+            <w:r>
+              <w:t xml:space="preserve">2</w:t>
+            </w:r>
           </w:p>
         </w:tc>
         <w:tc>
@@ -10567,6 +10631,9 @@
                 <w:highlight w:val="magenta"/>
               </w:rPr>
             </w:pPr>
+            <w:r>
+              <w:t xml:space="preserve">3</w:t>
+            </w:r>
           </w:p>
         </w:tc>
         <w:tc>
@@ -10616,10 +10683,8 @@
                 <w:sz w:val="24"/>
                 <w:szCs w:val="24"/>
               </w:rPr>
-              <w:t xml:space="preserve">показатель сохраняемости,  лет</w:t>
-            </w:r>
-            <w:proofErr w:type="gramStart"/>
-            <w:proofErr w:type="gramEnd"/>
+              <w:t>показатель сохраняемости, лет</w:t>
+            </w:r>
           </w:p>
         </w:tc>
         <w:tc>
@@ -10838,6 +10903,9 @@
                 <w:lang w:val="en-US"/>
               </w:rPr>
             </w:pPr>
+            <w:r>
+              <w:t xml:space="preserve">4</w:t>
+            </w:r>
           </w:p>
         </w:tc>
         <w:tc>
@@ -11125,6 +11193,9 @@
                 <w:highlight w:val="magenta"/>
               </w:rPr>
             </w:pPr>
+            <w:r>
+              <w:t xml:space="preserve">5</w:t>
+            </w:r>
           </w:p>
         </w:tc>
         <w:tc>
@@ -11390,6 +11461,9 @@
                 <w:highlight w:val="magenta"/>
               </w:rPr>
             </w:pPr>
+            <w:r>
+              <w:t xml:space="preserve">6</w:t>
+            </w:r>
           </w:p>
         </w:tc>
         <w:tc>
@@ -11656,6 +11730,9 @@
                 <w:highlight w:val="magenta"/>
               </w:rPr>
             </w:pPr>
+            <w:r>
+              <w:t xml:space="preserve">7</w:t>
+            </w:r>
           </w:p>
         </w:tc>
         <w:tc>
@@ -11705,10 +11782,8 @@
                 <w:sz w:val="24"/>
                 <w:szCs w:val="24"/>
               </w:rPr>
-              <w:t xml:space="preserve">давление окр. среды</w:t>
-            </w:r>
-            <w:proofErr w:type="spellStart"/>
-            <w:proofErr w:type="spellEnd"/>
+              <w:t>давление окр. среды</w:t>
+            </w:r>
           </w:p>
         </w:tc>
         <w:tc>
@@ -11922,6 +11997,9 @@
                 <w:highlight w:val="magenta"/>
               </w:rPr>
             </w:pPr>
+            <w:r>
+              <w:t xml:space="preserve">8</w:t>
+            </w:r>
           </w:p>
         </w:tc>
         <w:tc>
@@ -12183,6 +12261,9 @@
                 <w:highlight w:val="magenta"/>
               </w:rPr>
             </w:pPr>
+            <w:r>
+              <w:t xml:space="preserve">9</w:t>
+            </w:r>
           </w:p>
         </w:tc>
         <w:tc>
@@ -12456,6 +12537,9 @@
                 <w:highlight w:val="magenta"/>
               </w:rPr>
             </w:pPr>
+            <w:r>
+              <w:t xml:space="preserve">10</w:t>
+            </w:r>
           </w:p>
         </w:tc>
         <w:tc>
@@ -12716,6 +12800,9 @@
                 <w:highlight w:val="magenta"/>
               </w:rPr>
             </w:pPr>
+            <w:r>
+              <w:t xml:space="preserve">11</w:t>
+            </w:r>
           </w:p>
         </w:tc>
         <w:tc>
@@ -12985,6 +13072,9 @@
                 <w:lang w:val="en-US"/>
               </w:rPr>
             </w:pPr>
+            <w:r>
+              <w:t xml:space="preserve">12</w:t>
+            </w:r>
           </w:p>
         </w:tc>
         <w:tc>
@@ -14513,15 +14603,13 @@
                 <w:szCs w:val="24"/>
               </w:rPr>
             </w:pPr>
-            <w:proofErr w:type="gramStart"/>
-            <w:r>
-              <w:rPr>
-                <w:sz w:val="24"/>
-                <w:szCs w:val="24"/>
-              </w:rPr>
-              <w:t xml:space="preserve">Условия  эксплуатации  в  аппаратуре</w:t>
-            </w:r>
-            <w:proofErr w:type="gramEnd"/>
+            <w:r>
+              <w:rPr>
+                <w:sz w:val="24"/>
+                <w:szCs w:val="24"/>
+              </w:rPr>
+              <w:t>Условия эксплуатации в аппаратуре</w:t>
+            </w:r>
           </w:p>
         </w:tc>
         <w:tc>
@@ -14545,6 +14633,9 @@
                 <w:highlight w:val="magenta"/>
               </w:rPr>
             </w:pPr>
+            <w:r>
+              <w:t xml:space="preserve">1</w:t>
+            </w:r>
           </w:p>
         </w:tc>
         <w:tc>
@@ -14817,6 +14908,9 @@
                 <w:lang w:val="en-US"/>
               </w:rPr>
             </w:pPr>
+            <w:r>
+              <w:t xml:space="preserve">2</w:t>
+            </w:r>
           </w:p>
         </w:tc>
         <w:tc>
@@ -15067,6 +15161,9 @@
                 <w:highlight w:val="magenta"/>
               </w:rPr>
             </w:pPr>
+            <w:r>
+              <w:t xml:space="preserve">3</w:t>
+            </w:r>
           </w:p>
         </w:tc>
         <w:tc>
@@ -15116,10 +15213,8 @@
                 <w:sz w:val="24"/>
                 <w:szCs w:val="24"/>
               </w:rPr>
-              <w:t xml:space="preserve">показатель сохраняемости,  лет</w:t>
-            </w:r>
-            <w:proofErr w:type="gramStart"/>
-            <w:proofErr w:type="gramEnd"/>
+              <w:t>показатель сохраняемости, лет</w:t>
+            </w:r>
           </w:p>
         </w:tc>
         <w:tc>
@@ -15329,6 +15424,9 @@
                 <w:lang w:val="en-US"/>
               </w:rPr>
             </w:pPr>
+            <w:r>
+              <w:t xml:space="preserve">4</w:t>
+            </w:r>
           </w:p>
         </w:tc>
         <w:tc>
@@ -15607,6 +15705,9 @@
                 <w:highlight w:val="magenta"/>
               </w:rPr>
             </w:pPr>
+            <w:r>
+              <w:t xml:space="preserve">5</w:t>
+            </w:r>
           </w:p>
         </w:tc>
         <w:tc>
@@ -15863,6 +15964,9 @@
                 <w:highlight w:val="magenta"/>
               </w:rPr>
             </w:pPr>
+            <w:r>
+              <w:t xml:space="preserve">6</w:t>
+            </w:r>
           </w:p>
         </w:tc>
         <w:tc>
@@ -16120,6 +16224,9 @@
                 <w:highlight w:val="magenta"/>
               </w:rPr>
             </w:pPr>
+            <w:r>
+              <w:t xml:space="preserve">7</w:t>
+            </w:r>
           </w:p>
         </w:tc>
         <w:tc>
@@ -16169,10 +16276,8 @@
                 <w:sz w:val="24"/>
                 <w:szCs w:val="24"/>
               </w:rPr>
-              <w:t xml:space="preserve">давление окр. среды</w:t>
-            </w:r>
-            <w:proofErr w:type="spellStart"/>
-            <w:proofErr w:type="spellEnd"/>
+              <w:t>давление окр. среды</w:t>
+            </w:r>
           </w:p>
         </w:tc>
         <w:tc>
@@ -16377,6 +16482,9 @@
                 <w:highlight w:val="magenta"/>
               </w:rPr>
             </w:pPr>
+            <w:r>
+              <w:t xml:space="preserve">8</w:t>
+            </w:r>
           </w:p>
         </w:tc>
         <w:tc>
@@ -16629,6 +16737,9 @@
                 <w:highlight w:val="magenta"/>
               </w:rPr>
             </w:pPr>
+            <w:r>
+              <w:t xml:space="preserve">9</w:t>
+            </w:r>
           </w:p>
         </w:tc>
         <w:tc>
@@ -16893,6 +17004,9 @@
                 <w:highlight w:val="magenta"/>
               </w:rPr>
             </w:pPr>
+            <w:r>
+              <w:t xml:space="preserve">10</w:t>
+            </w:r>
           </w:p>
         </w:tc>
         <w:tc>
@@ -17144,6 +17258,9 @@
                 <w:highlight w:val="magenta"/>
               </w:rPr>
             </w:pPr>
+            <w:r>
+              <w:t xml:space="preserve">11</w:t>
+            </w:r>
           </w:p>
         </w:tc>
         <w:tc>
@@ -17404,6 +17521,9 @@
                 <w:lang w:val="en-US"/>
               </w:rPr>
             </w:pPr>
+            <w:r>
+              <w:t xml:space="preserve">12</w:t>
+            </w:r>
           </w:p>
         </w:tc>
         <w:tc>
@@ -20549,23 +20669,7 @@
                           <w:b/>
                           <w:bCs/>
                         </w:rPr>
-                        <w:t xml:space="preserve">Инв. № </w:t>
-                      </w:r>
-                      <w:proofErr w:type="spellStart"/>
-                      <w:r>
-                        <w:rPr>
-                          <w:b/>
-                          <w:bCs/>
-                        </w:rPr>
-                        <w:t>дубл</w:t>
-                      </w:r>
-                      <w:proofErr w:type="spellEnd"/>
-                      <w:r>
-                        <w:rPr>
-                          <w:b/>
-                          <w:bCs/>
-                        </w:rPr>
-                        <w:t>.</w:t>
+                        <w:t>Инв. № дубл.</w:t>
                       </w:r>
                     </w:p>
                   </wne:txbxContent>
@@ -21048,17 +21152,8 @@
                           <w:b/>
                           <w:bCs/>
                         </w:rPr>
-                        <w:t xml:space="preserve">Формат А3 </w:t>
+                        <w:t>Формат А3 А3</w:t>
                       </w:r>
-                      <w:proofErr w:type="spellStart"/>
-                      <w:r>
-                        <w:rPr>
-                          <w:b/>
-                          <w:bCs/>
-                        </w:rPr>
-                        <w:t>А3</w:t>
-                      </w:r>
-                      <w:proofErr w:type="spellEnd"/>
                       <w:r>
                         <w:rPr>
                           <w:b/>
@@ -21265,21 +21360,12 @@
                           <w:bCs/>
                         </w:rPr>
                       </w:pPr>
-                      <w:proofErr w:type="spellStart"/>
                       <w:r>
                         <w:rPr>
                           <w:b/>
                           <w:bCs/>
                         </w:rPr>
-                        <w:t>Взам</w:t>
-                      </w:r>
-                      <w:proofErr w:type="spellEnd"/>
-                      <w:r>
-                        <w:rPr>
-                          <w:b/>
-                          <w:bCs/>
-                        </w:rPr>
-                        <w:t>. инв.№</w:t>
+                        <w:t>Взам. инв.№</w:t>
                       </w:r>
                     </w:p>
                   </wne:txbxContent>

</xml_diff>